<commit_message>
> [resources/documents/consent-to-the-processing-of-personal-data.docx= - change docs for working with paste parameters
</commit_message>
<xml_diff>
--- a/resources/documents/consent-to-the-processing-of-personal-data.docx
+++ b/resources/documents/consent-to-the-processing-of-personal-data.docx
@@ -1,12 +1,11 @@
 
 <file path=word/document.xml><?xml version="1.0" encoding="utf-8"?>
-<w:document xmlns:o="urn:schemas-microsoft-com:office:office" xmlns:r="http://schemas.openxmlformats.org/officeDocument/2006/relationships" xmlns:v="urn:schemas-microsoft-com:vml" xmlns:w="http://schemas.openxmlformats.org/wordprocessingml/2006/main" xmlns:w10="urn:schemas-microsoft-com:office:word" xmlns:wp="http://schemas.openxmlformats.org/drawingml/2006/wordprocessingDrawing" xmlns:wps="http://schemas.microsoft.com/office/word/2010/wordprocessingShape" xmlns:wpg="http://schemas.microsoft.com/office/word/2010/wordprocessingGroup" xmlns:mc="http://schemas.openxmlformats.org/markup-compatibility/2006" xmlns:wp14="http://schemas.microsoft.com/office/word/2010/wordprocessingDrawing" xmlns:w14="http://schemas.microsoft.com/office/word/2010/wordml" xmlns:w15="http://schemas.microsoft.com/office/word/2012/wordml" mc:Ignorable="w14 wp14 w15">
+<w:document xmlns:wpc="http://schemas.microsoft.com/office/word/2010/wordprocessingCanvas" xmlns:cx="http://schemas.microsoft.com/office/drawing/2014/chartex" xmlns:cx1="http://schemas.microsoft.com/office/drawing/2015/9/8/chartex" xmlns:cx2="http://schemas.microsoft.com/office/drawing/2015/10/21/chartex" xmlns:cx3="http://schemas.microsoft.com/office/drawing/2016/5/9/chartex" xmlns:cx4="http://schemas.microsoft.com/office/drawing/2016/5/10/chartex" xmlns:cx5="http://schemas.microsoft.com/office/drawing/2016/5/11/chartex" xmlns:cx6="http://schemas.microsoft.com/office/drawing/2016/5/12/chartex" xmlns:cx7="http://schemas.microsoft.com/office/drawing/2016/5/13/chartex" xmlns:cx8="http://schemas.microsoft.com/office/drawing/2016/5/14/chartex" xmlns:mc="http://schemas.openxmlformats.org/markup-compatibility/2006" xmlns:aink="http://schemas.microsoft.com/office/drawing/2016/ink" xmlns:am3d="http://schemas.microsoft.com/office/drawing/2017/model3d" xmlns:o="urn:schemas-microsoft-com:office:office" xmlns:r="http://schemas.openxmlformats.org/officeDocument/2006/relationships" xmlns:m="http://schemas.openxmlformats.org/officeDocument/2006/math" xmlns:v="urn:schemas-microsoft-com:vml" xmlns:wp14="http://schemas.microsoft.com/office/word/2010/wordprocessingDrawing" xmlns:wp="http://schemas.openxmlformats.org/drawingml/2006/wordprocessingDrawing" xmlns:w10="urn:schemas-microsoft-com:office:word" xmlns:w="http://schemas.openxmlformats.org/wordprocessingml/2006/main" xmlns:w14="http://schemas.microsoft.com/office/word/2010/wordml" xmlns:w15="http://schemas.microsoft.com/office/word/2012/wordml" xmlns:w16cex="http://schemas.microsoft.com/office/word/2018/wordml/cex" xmlns:w16cid="http://schemas.microsoft.com/office/word/2016/wordml/cid" xmlns:w16="http://schemas.microsoft.com/office/word/2018/wordml" xmlns:w16se="http://schemas.microsoft.com/office/word/2015/wordml/symex" xmlns:wpg="http://schemas.microsoft.com/office/word/2010/wordprocessingGroup" xmlns:wpi="http://schemas.microsoft.com/office/word/2010/wordprocessingInk" xmlns:wne="http://schemas.microsoft.com/office/word/2006/wordml" xmlns:wps="http://schemas.microsoft.com/office/word/2010/wordprocessingShape" mc:Ignorable="w14 w15 w16se w16cid w16 w16cex wp14">
   <w:body>
     <w:p>
       <w:pPr>
-        <w:pStyle w:val="Normal"/>
-        <w:spacing w:lineRule="auto" w:line="240" w:before="0" w:after="0"/>
-        <w:ind w:left="5400" w:hanging="0"/>
+        <w:spacing w:after="0" w:line="240" w:lineRule="auto"/>
+        <w:ind w:left="5400"/>
         <w:rPr>
           <w:rFonts w:ascii="Times New Roman" w:hAnsi="Times New Roman"/>
           <w:sz w:val="24"/>
@@ -24,9 +23,8 @@
     </w:p>
     <w:p>
       <w:pPr>
-        <w:pStyle w:val="Normal"/>
-        <w:spacing w:lineRule="auto" w:line="240" w:before="0" w:after="0"/>
-        <w:ind w:left="5400" w:hanging="0"/>
+        <w:spacing w:after="0" w:line="240" w:lineRule="auto"/>
+        <w:ind w:left="5400"/>
         <w:rPr>
           <w:rFonts w:ascii="Times New Roman" w:hAnsi="Times New Roman"/>
           <w:sz w:val="24"/>
@@ -44,29 +42,37 @@
     </w:p>
     <w:p>
       <w:pPr>
-        <w:pStyle w:val="Normal"/>
-        <w:spacing w:lineRule="auto" w:line="240" w:before="0" w:after="0"/>
-        <w:ind w:left="5400" w:hanging="0"/>
-        <w:rPr>
-          <w:rFonts w:ascii="Times New Roman" w:hAnsi="Times New Roman"/>
-          <w:sz w:val="24"/>
-          <w:szCs w:val="24"/>
-        </w:rPr>
-      </w:pPr>
-      <w:r>
-        <w:rPr>
-          <w:rFonts w:ascii="Times New Roman" w:hAnsi="Times New Roman"/>
-          <w:sz w:val="24"/>
-          <w:szCs w:val="24"/>
-        </w:rPr>
-        <w:t>Бережковская наб., д. 30, корп. 1,</w:t>
+        <w:spacing w:after="0" w:line="240" w:lineRule="auto"/>
+        <w:ind w:left="5400"/>
+        <w:rPr>
+          <w:rFonts w:ascii="Times New Roman" w:hAnsi="Times New Roman"/>
+          <w:sz w:val="24"/>
+          <w:szCs w:val="24"/>
+        </w:rPr>
+      </w:pPr>
+      <w:proofErr w:type="spellStart"/>
+      <w:r>
+        <w:rPr>
+          <w:rFonts w:ascii="Times New Roman" w:hAnsi="Times New Roman"/>
+          <w:sz w:val="24"/>
+          <w:szCs w:val="24"/>
+        </w:rPr>
+        <w:t>Бережковская</w:t>
+      </w:r>
+      <w:proofErr w:type="spellEnd"/>
+      <w:r>
+        <w:rPr>
+          <w:rFonts w:ascii="Times New Roman" w:hAnsi="Times New Roman"/>
+          <w:sz w:val="24"/>
+          <w:szCs w:val="24"/>
+        </w:rPr>
+        <w:t xml:space="preserve"> наб., д. 30, корп. 1,</w:t>
       </w:r>
     </w:p>
     <w:p>
       <w:pPr>
-        <w:pStyle w:val="Normal"/>
-        <w:spacing w:lineRule="auto" w:line="240" w:before="0" w:after="0"/>
-        <w:ind w:left="5400" w:hanging="0"/>
+        <w:spacing w:after="0" w:line="240" w:lineRule="auto"/>
+        <w:ind w:left="5400"/>
         <w:rPr>
           <w:rFonts w:ascii="Times New Roman" w:hAnsi="Times New Roman"/>
           <w:sz w:val="24"/>
@@ -84,9 +90,8 @@
     </w:p>
     <w:p>
       <w:pPr>
-        <w:pStyle w:val="Normal"/>
-        <w:spacing w:lineRule="auto" w:line="240" w:before="0" w:after="0"/>
-        <w:ind w:left="5400" w:hanging="0"/>
+        <w:spacing w:after="0" w:line="240" w:lineRule="auto"/>
+        <w:ind w:left="5400"/>
         <w:rPr>
           <w:rFonts w:ascii="Times New Roman" w:hAnsi="Times New Roman"/>
           <w:sz w:val="24"/>
@@ -104,8 +109,7 @@
     </w:p>
     <w:p>
       <w:pPr>
-        <w:pStyle w:val="Normal"/>
-        <w:spacing w:lineRule="auto" w:line="240" w:before="0" w:after="0"/>
+        <w:spacing w:after="0" w:line="240" w:lineRule="auto"/>
         <w:ind w:firstLine="567"/>
         <w:rPr>
           <w:rFonts w:ascii="Times New Roman" w:hAnsi="Times New Roman"/>
@@ -113,23 +117,14 @@
           <w:szCs w:val="26"/>
         </w:rPr>
       </w:pPr>
-      <w:r>
-        <w:rPr>
-          <w:rFonts w:ascii="Times New Roman" w:hAnsi="Times New Roman"/>
-          <w:sz w:val="26"/>
-          <w:szCs w:val="26"/>
-        </w:rPr>
-      </w:r>
     </w:p>
     <w:p>
       <w:pPr>
-        <w:pStyle w:val="Normal"/>
-        <w:spacing w:lineRule="auto" w:line="240" w:before="120" w:after="0"/>
+        <w:spacing w:before="120" w:after="0" w:line="240" w:lineRule="auto"/>
         <w:ind w:firstLine="567"/>
         <w:jc w:val="both"/>
         <w:rPr>
-          <w:rFonts w:ascii="Times New Roman" w:hAnsi="Times New Roman" w:eastAsia="Calibri"/>
-          <w:b/>
+          <w:rFonts w:ascii="Times New Roman" w:eastAsia="Calibri" w:hAnsi="Times New Roman"/>
           <w:b/>
           <w:iCs/>
           <w:spacing w:val="-2"/>
@@ -157,7 +152,7 @@
       </w:r>
       <w:r>
         <w:rPr>
-          <w:rFonts w:eastAsia="Calibri" w:ascii="Times New Roman" w:hAnsi="Times New Roman"/>
+          <w:rFonts w:ascii="Times New Roman" w:eastAsia="Calibri" w:hAnsi="Times New Roman"/>
           <w:b/>
           <w:iCs/>
           <w:spacing w:val="-2"/>
@@ -168,23 +163,10 @@
         </w:rPr>
         <w:t>«</w:t>
       </w:r>
-      <w:r>
-        <w:rPr>
-          <w:rFonts w:eastAsia="Calibri" w:ascii="Times New Roman" w:hAnsi="Times New Roman"/>
-          <w:b/>
-          <w:iCs/>
-          <w:color w:val="C9211E"/>
-          <w:spacing w:val="-2"/>
-          <w:sz w:val="24"/>
-          <w:szCs w:val="24"/>
-          <w:u w:val="single"/>
-          <w:lang w:eastAsia="ru-RU"/>
-        </w:rPr>
-        <w:t>Название программы ЭВМ</w:t>
-      </w:r>
-      <w:r>
-        <w:rPr>
-          <w:rFonts w:eastAsia="Calibri" w:ascii="Times New Roman" w:hAnsi="Times New Roman"/>
+      <w:proofErr w:type="gramStart"/>
+      <w:r>
+        <w:rPr>
+          <w:rFonts w:ascii="Times New Roman" w:eastAsia="Calibri" w:hAnsi="Times New Roman"/>
           <w:b/>
           <w:iCs/>
           <w:spacing w:val="-2"/>
@@ -193,40 +175,100 @@
           <w:u w:val="single"/>
           <w:lang w:eastAsia="ru-RU"/>
         </w:rPr>
+        <w:t xml:space="preserve">{{ </w:t>
+      </w:r>
+      <w:proofErr w:type="spellStart"/>
+      <w:r>
+        <w:rPr>
+          <w:rFonts w:ascii="Times New Roman" w:eastAsia="Calibri" w:hAnsi="Times New Roman"/>
+          <w:b/>
+          <w:iCs/>
+          <w:spacing w:val="-2"/>
+          <w:sz w:val="24"/>
+          <w:szCs w:val="24"/>
+          <w:u w:val="single"/>
+          <w:lang w:val="en-US" w:eastAsia="ru-RU"/>
+        </w:rPr>
+        <w:t>ibm</w:t>
+      </w:r>
+      <w:proofErr w:type="spellEnd"/>
+      <w:proofErr w:type="gramEnd"/>
+      <w:r>
+        <w:rPr>
+          <w:rFonts w:ascii="Times New Roman" w:eastAsia="Calibri" w:hAnsi="Times New Roman"/>
+          <w:b/>
+          <w:iCs/>
+          <w:spacing w:val="-2"/>
+          <w:sz w:val="24"/>
+          <w:szCs w:val="24"/>
+          <w:u w:val="single"/>
+          <w:lang w:eastAsia="ru-RU"/>
+        </w:rPr>
+        <w:t>_</w:t>
+      </w:r>
+      <w:r>
+        <w:rPr>
+          <w:rFonts w:ascii="Times New Roman" w:eastAsia="Calibri" w:hAnsi="Times New Roman"/>
+          <w:b/>
+          <w:iCs/>
+          <w:spacing w:val="-2"/>
+          <w:sz w:val="24"/>
+          <w:szCs w:val="24"/>
+          <w:u w:val="single"/>
+          <w:lang w:val="en-US" w:eastAsia="ru-RU"/>
+        </w:rPr>
+        <w:t>name</w:t>
+      </w:r>
+      <w:r>
+        <w:rPr>
+          <w:rFonts w:ascii="Times New Roman" w:eastAsia="Calibri" w:hAnsi="Times New Roman"/>
+          <w:b/>
+          <w:iCs/>
+          <w:spacing w:val="-2"/>
+          <w:sz w:val="24"/>
+          <w:szCs w:val="24"/>
+          <w:u w:val="single"/>
+          <w:lang w:eastAsia="ru-RU"/>
+        </w:rPr>
+        <w:t xml:space="preserve"> }}</w:t>
+      </w:r>
+      <w:r>
+        <w:rPr>
+          <w:rFonts w:ascii="Times New Roman" w:eastAsia="Calibri" w:hAnsi="Times New Roman"/>
+          <w:b/>
+          <w:iCs/>
+          <w:spacing w:val="-2"/>
+          <w:sz w:val="24"/>
+          <w:szCs w:val="24"/>
+          <w:u w:val="single"/>
+          <w:lang w:eastAsia="ru-RU"/>
+        </w:rPr>
         <w:t>»</w:t>
       </w:r>
     </w:p>
     <w:p>
       <w:pPr>
-        <w:pStyle w:val="Normal"/>
-        <w:spacing w:lineRule="auto" w:line="240" w:before="120" w:after="0"/>
+        <w:spacing w:before="120" w:after="0" w:line="240" w:lineRule="auto"/>
         <w:ind w:firstLine="567"/>
         <w:jc w:val="both"/>
         <w:rPr>
           <w:rFonts w:ascii="Times New Roman" w:hAnsi="Times New Roman"/>
           <w:b/>
-          <w:b/>
-          <w:sz w:val="24"/>
-          <w:szCs w:val="24"/>
-          <w:u w:val="single"/>
-        </w:rPr>
-      </w:pPr>
-      <w:r>
-        <w:rPr>
-          <w:rFonts w:ascii="Times New Roman" w:hAnsi="Times New Roman"/>
-          <w:sz w:val="24"/>
-          <w:szCs w:val="24"/>
-        </w:rPr>
-        <w:t xml:space="preserve">№  </w:t>
-      </w:r>
-      <w:r>
-        <w:rPr>
-          <w:rFonts w:ascii="Times New Roman" w:hAnsi="Times New Roman"/>
-          <w:sz w:val="24"/>
-          <w:szCs w:val="24"/>
-        </w:rPr>
-        <w:t>заявки</w:t>
-      </w:r>
+          <w:sz w:val="24"/>
+          <w:szCs w:val="24"/>
+          <w:u w:val="single"/>
+        </w:rPr>
+      </w:pPr>
+      <w:proofErr w:type="gramStart"/>
+      <w:r>
+        <w:rPr>
+          <w:rFonts w:ascii="Times New Roman" w:hAnsi="Times New Roman"/>
+          <w:sz w:val="24"/>
+          <w:szCs w:val="24"/>
+        </w:rPr>
+        <w:t>№  заявки</w:t>
+      </w:r>
+      <w:proofErr w:type="gramEnd"/>
       <w:r>
         <w:rPr>
           <w:rFonts w:ascii="Times New Roman" w:hAnsi="Times New Roman"/>
@@ -248,14 +290,12 @@
     </w:p>
     <w:p>
       <w:pPr>
-        <w:pStyle w:val="Normal"/>
-        <w:spacing w:lineRule="auto" w:line="240" w:before="40" w:after="0"/>
+        <w:spacing w:before="40" w:after="0" w:line="240" w:lineRule="auto"/>
         <w:ind w:firstLine="720"/>
         <w:jc w:val="center"/>
         <w:rPr>
           <w:rFonts w:ascii="Times New Roman" w:hAnsi="Times New Roman"/>
           <w:i/>
-          <w:i/>
           <w:sz w:val="26"/>
           <w:szCs w:val="26"/>
           <w:vertAlign w:val="superscript"/>
@@ -274,14 +314,12 @@
     </w:p>
     <w:p>
       <w:pPr>
-        <w:pStyle w:val="Normal"/>
-        <w:spacing w:lineRule="auto" w:line="240" w:before="240" w:after="0"/>
+        <w:spacing w:before="240" w:after="0" w:line="240" w:lineRule="auto"/>
         <w:ind w:firstLine="567"/>
         <w:jc w:val="center"/>
         <w:rPr>
           <w:rFonts w:ascii="Times New Roman" w:hAnsi="Times New Roman"/>
           <w:b/>
-          <w:b/>
           <w:sz w:val="28"/>
           <w:szCs w:val="28"/>
           <w:lang w:eastAsia="ru-RU"/>
@@ -300,14 +338,12 @@
     </w:p>
     <w:p>
       <w:pPr>
-        <w:pStyle w:val="Normal"/>
-        <w:spacing w:lineRule="auto" w:line="240" w:before="240" w:after="0"/>
+        <w:spacing w:before="240" w:after="0" w:line="240" w:lineRule="auto"/>
         <w:ind w:firstLine="567"/>
         <w:jc w:val="both"/>
         <w:rPr>
           <w:rFonts w:ascii="Times New Roman" w:hAnsi="Times New Roman"/>
           <w:b/>
-          <w:b/>
           <w:sz w:val="24"/>
           <w:szCs w:val="24"/>
           <w:u w:val="single"/>
@@ -336,13 +372,56 @@
         <w:rPr>
           <w:rFonts w:ascii="Times New Roman" w:hAnsi="Times New Roman"/>
           <w:b/>
-          <w:color w:val="C9211E"/>
-          <w:sz w:val="24"/>
-          <w:szCs w:val="24"/>
-          <w:u w:val="single"/>
-          <w:lang w:eastAsia="ru-RU"/>
-        </w:rPr>
-        <w:t>Фамилия Имя Отчество</w:t>
+          <w:sz w:val="24"/>
+          <w:szCs w:val="24"/>
+          <w:u w:val="single"/>
+          <w:lang w:eastAsia="ru-RU"/>
+        </w:rPr>
+        <w:t xml:space="preserve">{{ </w:t>
+      </w:r>
+      <w:r>
+        <w:rPr>
+          <w:rFonts w:ascii="Times New Roman" w:hAnsi="Times New Roman"/>
+          <w:b/>
+          <w:sz w:val="24"/>
+          <w:szCs w:val="24"/>
+          <w:u w:val="single"/>
+          <w:lang w:val="en-US" w:eastAsia="ru-RU"/>
+        </w:rPr>
+        <w:t>full</w:t>
+      </w:r>
+      <w:r>
+        <w:rPr>
+          <w:rFonts w:ascii="Times New Roman" w:hAnsi="Times New Roman"/>
+          <w:b/>
+          <w:sz w:val="24"/>
+          <w:szCs w:val="24"/>
+          <w:u w:val="single"/>
+          <w:lang w:eastAsia="ru-RU"/>
+        </w:rPr>
+        <w:t>_</w:t>
+      </w:r>
+      <w:r>
+        <w:rPr>
+          <w:rFonts w:ascii="Times New Roman" w:hAnsi="Times New Roman"/>
+          <w:b/>
+          <w:sz w:val="24"/>
+          <w:szCs w:val="24"/>
+          <w:u w:val="single"/>
+          <w:lang w:val="en-US" w:eastAsia="ru-RU"/>
+        </w:rPr>
+        <w:t>name</w:t>
+      </w:r>
+      <w:r>
+        <w:rPr>
+          <w:rFonts w:ascii="Times New Roman" w:hAnsi="Times New Roman"/>
+          <w:b/>
+          <w:sz w:val="24"/>
+          <w:szCs w:val="24"/>
+          <w:u w:val="single"/>
+          <w:lang w:eastAsia="ru-RU"/>
+        </w:rPr>
+        <w:t xml:space="preserve"> }}</w:t>
       </w:r>
       <w:r>
         <w:rPr>
@@ -369,12 +448,10 @@
     </w:p>
     <w:p>
       <w:pPr>
-        <w:pStyle w:val="Normal"/>
-        <w:spacing w:lineRule="auto" w:line="240" w:before="120" w:after="0"/>
+        <w:spacing w:before="120" w:after="0" w:line="240" w:lineRule="auto"/>
         <w:ind w:firstLine="567"/>
         <w:rPr>
           <w:rFonts w:ascii="Times New Roman" w:hAnsi="Times New Roman"/>
-          <w:b/>
           <w:b/>
           <w:sz w:val="24"/>
           <w:szCs w:val="24"/>
@@ -400,20 +477,43 @@
           <w:szCs w:val="18"/>
           <w:u w:val="single"/>
         </w:rPr>
-        <w:t xml:space="preserve">  </w:t>
-      </w:r>
-      <w:r>
-        <w:rPr>
-          <w:rFonts w:ascii="Times New Roman" w:hAnsi="Times New Roman"/>
-          <w:b/>
-          <w:bCs/>
-          <w:color w:val="C9211E"/>
-          <w:sz w:val="24"/>
-          <w:szCs w:val="24"/>
-          <w:u w:val="single"/>
-          <w:lang w:eastAsia="ru-RU"/>
-        </w:rPr>
-        <w:t>Адрес прописки</w:t>
+        <w:t xml:space="preserve"> </w:t>
+      </w:r>
+      <w:r>
+        <w:rPr>
+          <w:rFonts w:ascii="Times New Roman" w:hAnsi="Times New Roman"/>
+          <w:b/>
+          <w:bCs/>
+          <w:sz w:val="24"/>
+          <w:szCs w:val="24"/>
+          <w:u w:val="single"/>
+          <w:lang w:eastAsia="ru-RU"/>
+        </w:rPr>
+        <w:t xml:space="preserve">{{ </w:t>
+      </w:r>
+      <w:r>
+        <w:rPr>
+          <w:rFonts w:ascii="Times New Roman" w:hAnsi="Times New Roman"/>
+          <w:b/>
+          <w:bCs/>
+          <w:sz w:val="24"/>
+          <w:szCs w:val="24"/>
+          <w:u w:val="single"/>
+          <w:lang w:val="en-US" w:eastAsia="ru-RU"/>
+        </w:rPr>
+        <w:t>address</w:t>
+      </w:r>
+      <w:r>
+        <w:rPr>
+          <w:rFonts w:ascii="Times New Roman" w:hAnsi="Times New Roman"/>
+          <w:b/>
+          <w:bCs/>
+          <w:sz w:val="24"/>
+          <w:szCs w:val="24"/>
+          <w:u w:val="single"/>
+          <w:lang w:eastAsia="ru-RU"/>
+        </w:rPr>
+        <w:t xml:space="preserve"> }}</w:t>
       </w:r>
       <w:r>
         <w:rPr>
@@ -440,17 +540,14 @@
     </w:p>
     <w:p>
       <w:pPr>
-        <w:pStyle w:val="Normal"/>
         <w:tabs>
-          <w:tab w:val="clear" w:pos="708"/>
-          <w:tab w:val="left" w:pos="1245" w:leader="none"/>
+          <w:tab w:val="left" w:pos="1245"/>
         </w:tabs>
-        <w:spacing w:lineRule="auto" w:line="360" w:before="240" w:after="0"/>
+        <w:spacing w:before="240" w:after="0" w:line="360" w:lineRule="auto"/>
         <w:ind w:firstLine="709"/>
         <w:rPr>
           <w:rFonts w:ascii="Times New Roman" w:hAnsi="Times New Roman"/>
           <w:b/>
-          <w:b/>
           <w:sz w:val="24"/>
           <w:szCs w:val="24"/>
           <w:u w:val="single"/>
@@ -497,20 +594,57 @@
           <w:u w:val="single"/>
           <w:lang w:eastAsia="ru-RU"/>
         </w:rPr>
-        <w:t xml:space="preserve">паспорт </w:t>
-      </w:r>
-      <w:r>
-        <w:rPr>
-          <w:rFonts w:ascii="Times New Roman" w:hAnsi="Times New Roman"/>
-          <w:b/>
-          <w:bCs/>
-          <w:color w:val="C9211E"/>
-          <w:sz w:val="24"/>
-          <w:szCs w:val="24"/>
-          <w:u w:val="single"/>
-          <w:lang w:eastAsia="ru-RU"/>
-        </w:rPr>
-        <w:t>0000 000000</w:t>
+        <w:t>паспорт</w:t>
+      </w:r>
+      <w:r>
+        <w:rPr>
+          <w:rFonts w:ascii="Times New Roman" w:hAnsi="Times New Roman"/>
+          <w:b/>
+          <w:bCs/>
+          <w:sz w:val="24"/>
+          <w:szCs w:val="24"/>
+          <w:u w:val="single"/>
+          <w:lang w:eastAsia="ru-RU"/>
+        </w:rPr>
+        <w:t xml:space="preserve"> </w:t>
+      </w:r>
+      <w:bookmarkStart w:id="0" w:name="_GoBack"/>
+      <w:bookmarkEnd w:id="0"/>
+      <w:r>
+        <w:rPr>
+          <w:rFonts w:ascii="Times New Roman" w:hAnsi="Times New Roman"/>
+          <w:b/>
+          <w:bCs/>
+          <w:sz w:val="24"/>
+          <w:szCs w:val="24"/>
+          <w:u w:val="single"/>
+          <w:lang w:eastAsia="ru-RU"/>
+        </w:rPr>
+        <w:t xml:space="preserve">{{ </w:t>
+      </w:r>
+      <w:r>
+        <w:rPr>
+          <w:rFonts w:ascii="Times New Roman" w:hAnsi="Times New Roman"/>
+          <w:b/>
+          <w:bCs/>
+          <w:sz w:val="24"/>
+          <w:szCs w:val="24"/>
+          <w:u w:val="single"/>
+          <w:lang w:val="en-US" w:eastAsia="ru-RU"/>
+        </w:rPr>
+        <w:t>passport</w:t>
+      </w:r>
+      <w:r>
+        <w:rPr>
+          <w:rFonts w:ascii="Times New Roman" w:hAnsi="Times New Roman"/>
+          <w:b/>
+          <w:bCs/>
+          <w:sz w:val="24"/>
+          <w:szCs w:val="24"/>
+          <w:u w:val="single"/>
+          <w:lang w:eastAsia="ru-RU"/>
+        </w:rPr>
+        <w:t xml:space="preserve"> }}</w:t>
       </w:r>
       <w:r>
         <w:rPr>
@@ -529,62 +663,132 @@
           <w:rFonts w:ascii="Times New Roman" w:hAnsi="Times New Roman"/>
           <w:b/>
           <w:bCs/>
-          <w:color w:val="C9211E"/>
-          <w:sz w:val="24"/>
-          <w:szCs w:val="24"/>
-          <w:u w:val="single"/>
-          <w:lang w:eastAsia="ru-RU"/>
-        </w:rPr>
-        <w:t>11.11.2011</w:t>
-      </w:r>
-      <w:r>
-        <w:rPr>
-          <w:rFonts w:ascii="Times New Roman" w:hAnsi="Times New Roman"/>
-          <w:b/>
-          <w:bCs/>
-          <w:sz w:val="24"/>
-          <w:szCs w:val="24"/>
-          <w:u w:val="single"/>
-          <w:lang w:eastAsia="ru-RU"/>
-        </w:rPr>
-        <w:t xml:space="preserve"> </w:t>
-      </w:r>
-      <w:r>
-        <w:rPr>
-          <w:rFonts w:ascii="Times New Roman" w:hAnsi="Times New Roman"/>
-          <w:b/>
-          <w:bCs/>
-          <w:sz w:val="24"/>
-          <w:szCs w:val="24"/>
-          <w:u w:val="single"/>
-          <w:lang w:eastAsia="ru-RU"/>
-        </w:rPr>
-        <w:t xml:space="preserve">                                     </w:t>
-      </w:r>
-      <w:r>
-        <w:rPr>
-          <w:rFonts w:ascii="Times New Roman" w:hAnsi="Times New Roman"/>
-          <w:b/>
-          <w:bCs/>
-          <w:sz w:val="24"/>
-          <w:szCs w:val="24"/>
-          <w:u w:val="single"/>
-          <w:lang w:eastAsia="ru-RU"/>
-        </w:rPr>
-        <w:t xml:space="preserve"> </w:t>
-      </w:r>
-      <w:r>
-        <w:rPr>
-          <w:rFonts w:ascii="Times New Roman" w:hAnsi="Times New Roman"/>
-          <w:b/>
-          <w:bCs/>
-          <w:color w:val="C9211E"/>
-          <w:sz w:val="24"/>
-          <w:szCs w:val="24"/>
-          <w:u w:val="single"/>
-          <w:lang w:eastAsia="ru-RU"/>
-        </w:rPr>
-        <w:t>кем</w:t>
+          <w:sz w:val="24"/>
+          <w:szCs w:val="24"/>
+          <w:u w:val="single"/>
+          <w:lang w:eastAsia="ru-RU"/>
+        </w:rPr>
+        <w:t xml:space="preserve">{{ </w:t>
+      </w:r>
+      <w:r>
+        <w:rPr>
+          <w:rFonts w:ascii="Times New Roman" w:hAnsi="Times New Roman"/>
+          <w:b/>
+          <w:bCs/>
+          <w:sz w:val="24"/>
+          <w:szCs w:val="24"/>
+          <w:u w:val="single"/>
+          <w:lang w:val="en-US" w:eastAsia="ru-RU"/>
+        </w:rPr>
+        <w:t>data</w:t>
+      </w:r>
+      <w:r>
+        <w:rPr>
+          <w:rFonts w:ascii="Times New Roman" w:hAnsi="Times New Roman"/>
+          <w:b/>
+          <w:bCs/>
+          <w:sz w:val="24"/>
+          <w:szCs w:val="24"/>
+          <w:u w:val="single"/>
+          <w:lang w:eastAsia="ru-RU"/>
+        </w:rPr>
+        <w:t>_</w:t>
+      </w:r>
+      <w:r>
+        <w:rPr>
+          <w:rFonts w:ascii="Times New Roman" w:hAnsi="Times New Roman"/>
+          <w:b/>
+          <w:bCs/>
+          <w:sz w:val="24"/>
+          <w:szCs w:val="24"/>
+          <w:u w:val="single"/>
+          <w:lang w:val="en-US" w:eastAsia="ru-RU"/>
+        </w:rPr>
+        <w:t>issue</w:t>
+      </w:r>
+      <w:r>
+        <w:rPr>
+          <w:rFonts w:ascii="Times New Roman" w:hAnsi="Times New Roman"/>
+          <w:b/>
+          <w:bCs/>
+          <w:sz w:val="24"/>
+          <w:szCs w:val="24"/>
+          <w:u w:val="single"/>
+          <w:lang w:eastAsia="ru-RU"/>
+        </w:rPr>
+        <w:t xml:space="preserve"> }}</w:t>
+      </w:r>
+      <w:r>
+        <w:rPr>
+          <w:rFonts w:ascii="Times New Roman" w:hAnsi="Times New Roman"/>
+          <w:b/>
+          <w:bCs/>
+          <w:sz w:val="24"/>
+          <w:szCs w:val="24"/>
+          <w:u w:val="single"/>
+          <w:lang w:eastAsia="ru-RU"/>
+        </w:rPr>
+        <w:t xml:space="preserve">                                       </w:t>
+      </w:r>
+      <w:r>
+        <w:rPr>
+          <w:rFonts w:ascii="Times New Roman" w:hAnsi="Times New Roman"/>
+          <w:b/>
+          <w:bCs/>
+          <w:sz w:val="24"/>
+          <w:szCs w:val="24"/>
+          <w:u w:val="single"/>
+          <w:lang w:eastAsia="ru-RU"/>
+        </w:rPr>
+        <w:t xml:space="preserve">{{ </w:t>
+      </w:r>
+      <w:r>
+        <w:rPr>
+          <w:rFonts w:ascii="Times New Roman" w:hAnsi="Times New Roman"/>
+          <w:b/>
+          <w:bCs/>
+          <w:sz w:val="24"/>
+          <w:szCs w:val="24"/>
+          <w:u w:val="single"/>
+          <w:lang w:val="en-US" w:eastAsia="ru-RU"/>
+        </w:rPr>
+        <w:t>issue</w:t>
+      </w:r>
+      <w:r>
+        <w:rPr>
+          <w:rFonts w:ascii="Times New Roman" w:hAnsi="Times New Roman"/>
+          <w:b/>
+          <w:bCs/>
+          <w:sz w:val="24"/>
+          <w:szCs w:val="24"/>
+          <w:u w:val="single"/>
+          <w:lang w:eastAsia="ru-RU"/>
+        </w:rPr>
+        <w:t>_</w:t>
+      </w:r>
+      <w:r>
+        <w:rPr>
+          <w:rFonts w:ascii="Times New Roman" w:hAnsi="Times New Roman"/>
+          <w:b/>
+          <w:bCs/>
+          <w:sz w:val="24"/>
+          <w:szCs w:val="24"/>
+          <w:u w:val="single"/>
+          <w:lang w:val="en-US" w:eastAsia="ru-RU"/>
+        </w:rPr>
+        <w:t>by</w:t>
+      </w:r>
+      <w:r>
+        <w:rPr>
+          <w:rFonts w:ascii="Times New Roman" w:hAnsi="Times New Roman"/>
+          <w:b/>
+          <w:bCs/>
+          <w:sz w:val="24"/>
+          <w:szCs w:val="24"/>
+          <w:u w:val="single"/>
+          <w:lang w:eastAsia="ru-RU"/>
+        </w:rPr>
+        <w:t xml:space="preserve"> }}</w:t>
       </w:r>
       <w:r>
         <w:rPr>
@@ -600,15 +804,13 @@
     </w:p>
     <w:p>
       <w:pPr>
-        <w:pStyle w:val="Normal"/>
-        <w:spacing w:lineRule="auto" w:line="288" w:before="240" w:after="0"/>
+        <w:spacing w:before="240" w:after="0" w:line="288" w:lineRule="auto"/>
         <w:ind w:firstLine="567"/>
         <w:jc w:val="both"/>
         <w:rPr>
           <w:rFonts w:ascii="Times New Roman" w:hAnsi="Times New Roman"/>
           <w:bCs/>
           <w:i/>
-          <w:i/>
           <w:sz w:val="26"/>
           <w:szCs w:val="26"/>
           <w:lang w:eastAsia="ru-RU"/>
@@ -641,6 +843,14 @@
           <w:lang w:eastAsia="ru-RU"/>
         </w:rPr>
         <w:t xml:space="preserve"> от 27 июля 2006 г. </w:t>
+      </w:r>
+      <w:r>
+        <w:rPr>
+          <w:rFonts w:ascii="Times New Roman" w:hAnsi="Times New Roman"/>
+          <w:sz w:val="26"/>
+          <w:szCs w:val="26"/>
+          <w:lang w:eastAsia="ru-RU"/>
+        </w:rPr>
         <w:br/>
         <w:t>№ 152-ФЗ «О персональных данных»,</w:t>
       </w:r>
@@ -676,9 +886,8 @@
     </w:p>
     <w:p>
       <w:pPr>
-        <w:pStyle w:val="Normal"/>
-        <w:widowControl w:val="false"/>
-        <w:spacing w:lineRule="auto" w:line="288" w:before="0" w:after="0"/>
+        <w:widowControl w:val="0"/>
+        <w:spacing w:after="0" w:line="288" w:lineRule="auto"/>
         <w:ind w:firstLine="567"/>
         <w:jc w:val="both"/>
         <w:rPr>
@@ -730,9 +939,8 @@
     </w:p>
     <w:p>
       <w:pPr>
-        <w:pStyle w:val="Normal"/>
-        <w:widowControl w:val="false"/>
-        <w:spacing w:lineRule="auto" w:line="240" w:before="0" w:after="0"/>
+        <w:widowControl w:val="0"/>
+        <w:spacing w:after="0" w:line="240" w:lineRule="auto"/>
         <w:ind w:firstLine="720"/>
         <w:jc w:val="both"/>
         <w:rPr>
@@ -742,20 +950,11 @@
           <w:szCs w:val="24"/>
         </w:rPr>
       </w:pPr>
-      <w:r>
-        <w:rPr>
-          <w:rFonts w:ascii="Times New Roman" w:hAnsi="Times New Roman"/>
-          <w:strike/>
-          <w:sz w:val="24"/>
-          <w:szCs w:val="24"/>
-        </w:rPr>
-      </w:r>
     </w:p>
     <w:p>
       <w:pPr>
-        <w:pStyle w:val="Normal"/>
-        <w:widowControl w:val="false"/>
-        <w:spacing w:lineRule="auto" w:line="240" w:before="0" w:after="0"/>
+        <w:widowControl w:val="0"/>
+        <w:spacing w:after="0" w:line="240" w:lineRule="auto"/>
         <w:ind w:firstLine="720"/>
         <w:jc w:val="both"/>
         <w:rPr>
@@ -765,26 +964,17 @@
           <w:szCs w:val="24"/>
         </w:rPr>
       </w:pPr>
-      <w:r>
-        <w:rPr>
-          <w:rFonts w:ascii="Times New Roman" w:hAnsi="Times New Roman"/>
-          <w:strike/>
-          <w:sz w:val="24"/>
-          <w:szCs w:val="24"/>
-        </w:rPr>
-      </w:r>
     </w:p>
     <w:p>
       <w:pPr>
-        <w:pStyle w:val="Normal"/>
-        <w:spacing w:lineRule="auto" w:line="240" w:before="120" w:after="0"/>
+        <w:spacing w:before="120" w:after="0" w:line="240" w:lineRule="auto"/>
         <w:ind w:left="1077" w:hanging="793"/>
         <w:jc w:val="both"/>
         <w:rPr>
           <w:rFonts w:ascii="Times New Roman" w:hAnsi="Times New Roman"/>
           <w:sz w:val="26"/>
           <w:szCs w:val="26"/>
-          <w:lang w:eastAsia="ru-RU"/>
+          <w:lang w:val="en-US" w:eastAsia="ru-RU"/>
         </w:rPr>
       </w:pPr>
       <w:r>
@@ -795,9 +985,41 @@
           <w:lang w:eastAsia="ru-RU"/>
         </w:rPr>
         <w:t>Подпись</w:t>
+      </w:r>
+      <w:r>
+        <w:rPr>
+          <w:rFonts w:ascii="Times New Roman" w:hAnsi="Times New Roman"/>
+          <w:sz w:val="24"/>
+          <w:szCs w:val="24"/>
+          <w:lang w:val="en-US" w:eastAsia="ru-RU"/>
+        </w:rPr>
         <w:tab/>
+      </w:r>
+      <w:r>
+        <w:rPr>
+          <w:rFonts w:ascii="Times New Roman" w:hAnsi="Times New Roman"/>
+          <w:sz w:val="24"/>
+          <w:szCs w:val="24"/>
+          <w:lang w:val="en-US" w:eastAsia="ru-RU"/>
+        </w:rPr>
         <w:tab/>
+      </w:r>
+      <w:r>
+        <w:rPr>
+          <w:rFonts w:ascii="Times New Roman" w:hAnsi="Times New Roman"/>
+          <w:sz w:val="24"/>
+          <w:szCs w:val="24"/>
+          <w:lang w:val="en-US" w:eastAsia="ru-RU"/>
+        </w:rPr>
         <w:tab/>
+      </w:r>
+      <w:r>
+        <w:rPr>
+          <w:rFonts w:ascii="Times New Roman" w:hAnsi="Times New Roman"/>
+          <w:sz w:val="24"/>
+          <w:szCs w:val="24"/>
+          <w:lang w:val="en-US" w:eastAsia="ru-RU"/>
+        </w:rPr>
         <w:tab/>
       </w:r>
       <w:r>
@@ -805,9 +1027,17 @@
           <w:rFonts w:ascii="Times New Roman" w:hAnsi="Times New Roman"/>
           <w:sz w:val="26"/>
           <w:szCs w:val="26"/>
-          <w:lang w:eastAsia="ru-RU"/>
+          <w:lang w:val="en-US" w:eastAsia="ru-RU"/>
         </w:rPr>
         <w:tab/>
+      </w:r>
+      <w:r>
+        <w:rPr>
+          <w:rFonts w:ascii="Times New Roman" w:hAnsi="Times New Roman"/>
+          <w:sz w:val="26"/>
+          <w:szCs w:val="26"/>
+          <w:lang w:val="en-US" w:eastAsia="ru-RU"/>
+        </w:rPr>
         <w:tab/>
         <w:t xml:space="preserve">            /</w:t>
       </w:r>
@@ -817,81 +1047,68 @@
           <w:sz w:val="24"/>
           <w:szCs w:val="24"/>
           <w:u w:val="single"/>
-          <w:lang w:eastAsia="ru-RU"/>
+          <w:lang w:val="en-US" w:eastAsia="ru-RU"/>
         </w:rPr>
         <w:t>___</w:t>
       </w:r>
-      <w:r>
-        <w:rPr>
-          <w:rFonts w:ascii="Times New Roman" w:hAnsi="Times New Roman"/>
-          <w:color w:val="C9211E"/>
-          <w:sz w:val="24"/>
-          <w:szCs w:val="24"/>
-          <w:u w:val="single"/>
-          <w:lang w:eastAsia="ru-RU"/>
-        </w:rPr>
-        <w:t>Фамилия</w:t>
-      </w:r>
-      <w:r>
-        <w:rPr>
-          <w:rFonts w:ascii="Times New Roman" w:hAnsi="Times New Roman"/>
-          <w:color w:val="C9211E"/>
-          <w:sz w:val="24"/>
-          <w:szCs w:val="24"/>
-          <w:u w:val="single"/>
-          <w:lang w:eastAsia="ru-RU"/>
-        </w:rPr>
-        <w:t xml:space="preserve"> И.</w:t>
-      </w:r>
-      <w:r>
-        <w:rPr>
-          <w:rFonts w:ascii="Times New Roman" w:hAnsi="Times New Roman"/>
-          <w:color w:val="C9211E"/>
-          <w:sz w:val="24"/>
-          <w:szCs w:val="24"/>
-          <w:u w:val="single"/>
-          <w:lang w:eastAsia="ru-RU"/>
-        </w:rPr>
-        <w:t>О</w:t>
-      </w:r>
-      <w:r>
-        <w:rPr>
-          <w:rFonts w:ascii="Times New Roman" w:hAnsi="Times New Roman"/>
-          <w:color w:val="C9211E"/>
-          <w:sz w:val="24"/>
-          <w:szCs w:val="24"/>
-          <w:u w:val="single"/>
-          <w:lang w:eastAsia="ru-RU"/>
-        </w:rPr>
-        <w:t>.</w:t>
-      </w:r>
-      <w:r>
-        <w:rPr>
-          <w:rFonts w:ascii="Times New Roman" w:hAnsi="Times New Roman"/>
-          <w:sz w:val="24"/>
-          <w:szCs w:val="24"/>
-          <w:u w:val="single"/>
-          <w:lang w:eastAsia="ru-RU"/>
+      <w:proofErr w:type="gramStart"/>
+      <w:r>
+        <w:rPr>
+          <w:rFonts w:ascii="Times New Roman" w:hAnsi="Times New Roman"/>
+          <w:sz w:val="24"/>
+          <w:szCs w:val="24"/>
+          <w:u w:val="single"/>
+          <w:lang w:val="en-US" w:eastAsia="ru-RU"/>
+        </w:rPr>
+        <w:t>{</w:t>
+      </w:r>
+      <w:proofErr w:type="gramEnd"/>
+      <w:r>
+        <w:rPr>
+          <w:rFonts w:ascii="Times New Roman" w:hAnsi="Times New Roman"/>
+          <w:sz w:val="24"/>
+          <w:szCs w:val="24"/>
+          <w:u w:val="single"/>
+          <w:lang w:val="en-US" w:eastAsia="ru-RU"/>
+        </w:rPr>
+        <w:t>{ initials }}</w:t>
+      </w:r>
+      <w:r>
+        <w:rPr>
+          <w:rFonts w:ascii="Times New Roman" w:hAnsi="Times New Roman"/>
+          <w:sz w:val="24"/>
+          <w:szCs w:val="24"/>
+          <w:u w:val="single"/>
+          <w:lang w:val="en-US" w:eastAsia="ru-RU"/>
         </w:rPr>
         <w:t>___________/</w:t>
       </w:r>
     </w:p>
     <w:p>
       <w:pPr>
-        <w:pStyle w:val="Normal"/>
-        <w:spacing w:lineRule="auto" w:line="240" w:before="40" w:after="0"/>
+        <w:spacing w:before="40" w:after="0" w:line="240" w:lineRule="auto"/>
         <w:ind w:firstLine="5670"/>
         <w:jc w:val="both"/>
         <w:rPr>
           <w:rFonts w:ascii="Times New Roman" w:hAnsi="Times New Roman"/>
           <w:i/>
+          <w:sz w:val="26"/>
+          <w:szCs w:val="26"/>
+          <w:vertAlign w:val="superscript"/>
+          <w:lang w:eastAsia="ru-RU"/>
+        </w:rPr>
+      </w:pPr>
+      <w:r>
+        <w:rPr>
+          <w:rFonts w:ascii="Times New Roman" w:hAnsi="Times New Roman"/>
           <w:i/>
           <w:sz w:val="26"/>
           <w:szCs w:val="26"/>
           <w:vertAlign w:val="superscript"/>
-          <w:lang w:eastAsia="ru-RU"/>
-        </w:rPr>
-      </w:pPr>
+          <w:lang w:val="en-US" w:eastAsia="ru-RU"/>
+        </w:rPr>
+        <w:t xml:space="preserve"> (</w:t>
+      </w:r>
       <w:r>
         <w:rPr>
           <w:rFonts w:ascii="Times New Roman" w:hAnsi="Times New Roman"/>
@@ -901,7 +1118,7 @@
           <w:vertAlign w:val="superscript"/>
           <w:lang w:eastAsia="ru-RU"/>
         </w:rPr>
-        <w:t xml:space="preserve"> </w:t>
+        <w:t>Ф</w:t>
       </w:r>
       <w:r>
         <w:rPr>
@@ -910,12 +1127,66 @@
           <w:sz w:val="26"/>
           <w:szCs w:val="26"/>
           <w:vertAlign w:val="superscript"/>
-          <w:lang w:eastAsia="ru-RU"/>
-        </w:rPr>
-        <w:t>(Ф. И. О.  субъекта</w:t>
-      </w:r>
-      <w:r>
-        <w:rPr/>
+          <w:lang w:val="en-US" w:eastAsia="ru-RU"/>
+        </w:rPr>
+        <w:t xml:space="preserve">. </w:t>
+      </w:r>
+      <w:r>
+        <w:rPr>
+          <w:rFonts w:ascii="Times New Roman" w:hAnsi="Times New Roman"/>
+          <w:i/>
+          <w:sz w:val="26"/>
+          <w:szCs w:val="26"/>
+          <w:vertAlign w:val="superscript"/>
+          <w:lang w:eastAsia="ru-RU"/>
+        </w:rPr>
+        <w:t>И</w:t>
+      </w:r>
+      <w:r>
+        <w:rPr>
+          <w:rFonts w:ascii="Times New Roman" w:hAnsi="Times New Roman"/>
+          <w:i/>
+          <w:sz w:val="26"/>
+          <w:szCs w:val="26"/>
+          <w:vertAlign w:val="superscript"/>
+          <w:lang w:val="en-US" w:eastAsia="ru-RU"/>
+        </w:rPr>
+        <w:t xml:space="preserve">. </w:t>
+      </w:r>
+      <w:r>
+        <w:rPr>
+          <w:rFonts w:ascii="Times New Roman" w:hAnsi="Times New Roman"/>
+          <w:i/>
+          <w:sz w:val="26"/>
+          <w:szCs w:val="26"/>
+          <w:vertAlign w:val="superscript"/>
+          <w:lang w:eastAsia="ru-RU"/>
+        </w:rPr>
+        <w:t>О</w:t>
+      </w:r>
+      <w:r>
+        <w:rPr>
+          <w:rFonts w:ascii="Times New Roman" w:hAnsi="Times New Roman"/>
+          <w:i/>
+          <w:sz w:val="26"/>
+          <w:szCs w:val="26"/>
+          <w:vertAlign w:val="superscript"/>
+          <w:lang w:val="en-US" w:eastAsia="ru-RU"/>
+        </w:rPr>
+        <w:t xml:space="preserve">.  </w:t>
+      </w:r>
+      <w:r>
+        <w:rPr>
+          <w:rFonts w:ascii="Times New Roman" w:hAnsi="Times New Roman"/>
+          <w:i/>
+          <w:sz w:val="26"/>
+          <w:szCs w:val="26"/>
+          <w:vertAlign w:val="superscript"/>
+          <w:lang w:eastAsia="ru-RU"/>
+        </w:rPr>
+        <w:t>субъекта</w:t>
+      </w:r>
+      <w:r>
         <w:t xml:space="preserve"> </w:t>
       </w:r>
       <w:r>
@@ -932,8 +1203,7 @@
     </w:p>
     <w:p>
       <w:pPr>
-        <w:pStyle w:val="Normal"/>
-        <w:spacing w:lineRule="auto" w:line="240" w:before="0" w:after="0"/>
+        <w:spacing w:after="0" w:line="240" w:lineRule="auto"/>
         <w:ind w:firstLine="5670"/>
         <w:jc w:val="both"/>
         <w:rPr>
@@ -942,18 +1212,9 @@
           <w:szCs w:val="24"/>
         </w:rPr>
       </w:pPr>
-      <w:r>
-        <w:rPr>
-          <w:rFonts w:ascii="Times New Roman" w:hAnsi="Times New Roman"/>
-          <w:sz w:val="24"/>
-          <w:szCs w:val="24"/>
-        </w:rPr>
-      </w:r>
     </w:p>
     <w:p>
       <w:pPr>
-        <w:pStyle w:val="Normal"/>
-        <w:spacing w:before="0" w:after="160"/>
         <w:ind w:firstLine="5529"/>
         <w:rPr>
           <w:rFonts w:ascii="Times New Roman" w:hAnsi="Times New Roman"/>
@@ -985,24 +1246,22 @@
       </w:r>
     </w:p>
     <w:sectPr>
-      <w:type w:val="nextPage"/>
       <w:pgSz w:w="11906" w:h="16838"/>
-      <w:pgMar w:left="1701" w:right="850" w:gutter="0" w:header="0" w:top="1134" w:footer="0" w:bottom="1134"/>
-      <w:pgNumType w:fmt="decimal"/>
-      <w:formProt w:val="false"/>
-      <w:textDirection w:val="lrTb"/>
-      <w:docGrid w:type="default" w:linePitch="360" w:charSpace="8192"/>
+      <w:pgMar w:top="1134" w:right="850" w:bottom="1134" w:left="1701" w:header="0" w:footer="0" w:gutter="0"/>
+      <w:cols w:space="720"/>
+      <w:formProt w:val="0"/>
+      <w:docGrid w:linePitch="360" w:charSpace="8192"/>
     </w:sectPr>
   </w:body>
 </w:document>
 </file>
 
 <file path=word/styles.xml><?xml version="1.0" encoding="utf-8"?>
-<w:styles xmlns:w="http://schemas.openxmlformats.org/wordprocessingml/2006/main" xmlns:w14="http://schemas.microsoft.com/office/word/2010/wordml" xmlns:mc="http://schemas.openxmlformats.org/markup-compatibility/2006" mc:Ignorable="w14">
+<w:styles xmlns:mc="http://schemas.openxmlformats.org/markup-compatibility/2006" xmlns:r="http://schemas.openxmlformats.org/officeDocument/2006/relationships" xmlns:w="http://schemas.openxmlformats.org/wordprocessingml/2006/main" xmlns:w14="http://schemas.microsoft.com/office/word/2010/wordml" xmlns:w15="http://schemas.microsoft.com/office/word/2012/wordml" xmlns:w16cex="http://schemas.microsoft.com/office/word/2018/wordml/cex" xmlns:w16cid="http://schemas.microsoft.com/office/word/2016/wordml/cid" xmlns:w16="http://schemas.microsoft.com/office/word/2018/wordml" xmlns:w16se="http://schemas.microsoft.com/office/word/2015/wordml/symex" mc:Ignorable="w14 w15 w16se w16cid w16 w16cex">
   <w:docDefaults>
     <w:rPrDefault>
       <w:rPr>
-        <w:rFonts w:ascii="Calibri" w:hAnsi="Calibri" w:eastAsia="Calibri" w:cs="" w:asciiTheme="minorHAnsi" w:cstheme="minorBidi" w:eastAsiaTheme="minorHAnsi" w:hAnsiTheme="minorHAnsi"/>
+        <w:rFonts w:asciiTheme="minorHAnsi" w:eastAsiaTheme="minorHAnsi" w:hAnsiTheme="minorHAnsi" w:cstheme="minorBidi"/>
         <w:sz w:val="22"/>
         <w:szCs w:val="22"/>
         <w:lang w:val="ru-RU" w:eastAsia="en-US" w:bidi="ar-SA"/>
@@ -1010,21 +1269,21 @@
     </w:rPrDefault>
     <w:pPrDefault>
       <w:pPr>
-        <w:suppressAutoHyphens w:val="true"/>
+        <w:suppressAutoHyphens/>
       </w:pPr>
     </w:pPrDefault>
   </w:docDefaults>
   <w:latentStyles w:defLockedState="0" w:defUIPriority="99" w:defSemiHidden="0" w:defUnhideWhenUsed="0" w:defQFormat="0" w:count="376">
     <w:lsdException w:name="Normal" w:uiPriority="0" w:qFormat="1"/>
     <w:lsdException w:name="heading 1" w:uiPriority="9" w:qFormat="1"/>
-    <w:lsdException w:name="heading 2" w:uiPriority="9" w:semiHidden="1" w:unhideWhenUsed="1" w:qFormat="1"/>
-    <w:lsdException w:name="heading 3" w:uiPriority="9" w:semiHidden="1" w:unhideWhenUsed="1" w:qFormat="1"/>
-    <w:lsdException w:name="heading 4" w:uiPriority="9" w:semiHidden="1" w:unhideWhenUsed="1" w:qFormat="1"/>
-    <w:lsdException w:name="heading 5" w:uiPriority="9" w:semiHidden="1" w:unhideWhenUsed="1" w:qFormat="1"/>
-    <w:lsdException w:name="heading 6" w:uiPriority="9" w:semiHidden="1" w:unhideWhenUsed="1" w:qFormat="1"/>
-    <w:lsdException w:name="heading 7" w:uiPriority="9" w:semiHidden="1" w:unhideWhenUsed="1" w:qFormat="1"/>
-    <w:lsdException w:name="heading 8" w:uiPriority="9" w:semiHidden="1" w:unhideWhenUsed="1" w:qFormat="1"/>
-    <w:lsdException w:name="heading 9" w:uiPriority="9" w:semiHidden="1" w:unhideWhenUsed="1" w:qFormat="1"/>
+    <w:lsdException w:name="heading 2" w:semiHidden="1" w:uiPriority="9" w:unhideWhenUsed="1" w:qFormat="1"/>
+    <w:lsdException w:name="heading 3" w:semiHidden="1" w:uiPriority="9" w:unhideWhenUsed="1" w:qFormat="1"/>
+    <w:lsdException w:name="heading 4" w:semiHidden="1" w:uiPriority="9" w:unhideWhenUsed="1" w:qFormat="1"/>
+    <w:lsdException w:name="heading 5" w:semiHidden="1" w:uiPriority="9" w:unhideWhenUsed="1" w:qFormat="1"/>
+    <w:lsdException w:name="heading 6" w:semiHidden="1" w:uiPriority="9" w:unhideWhenUsed="1" w:qFormat="1"/>
+    <w:lsdException w:name="heading 7" w:semiHidden="1" w:uiPriority="9" w:unhideWhenUsed="1" w:qFormat="1"/>
+    <w:lsdException w:name="heading 8" w:semiHidden="1" w:uiPriority="9" w:unhideWhenUsed="1" w:qFormat="1"/>
+    <w:lsdException w:name="heading 9" w:semiHidden="1" w:uiPriority="9" w:unhideWhenUsed="1" w:qFormat="1"/>
     <w:lsdException w:name="index 1" w:semiHidden="1" w:unhideWhenUsed="1"/>
     <w:lsdException w:name="index 2" w:semiHidden="1" w:unhideWhenUsed="1"/>
     <w:lsdException w:name="index 3" w:semiHidden="1" w:unhideWhenUsed="1"/>
@@ -1034,22 +1293,22 @@
     <w:lsdException w:name="index 7" w:semiHidden="1" w:unhideWhenUsed="1"/>
     <w:lsdException w:name="index 8" w:semiHidden="1" w:unhideWhenUsed="1"/>
     <w:lsdException w:name="index 9" w:semiHidden="1" w:unhideWhenUsed="1"/>
-    <w:lsdException w:name="toc 1" w:uiPriority="39" w:semiHidden="1" w:unhideWhenUsed="1"/>
-    <w:lsdException w:name="toc 2" w:uiPriority="39" w:semiHidden="1" w:unhideWhenUsed="1"/>
-    <w:lsdException w:name="toc 3" w:uiPriority="39" w:semiHidden="1" w:unhideWhenUsed="1"/>
-    <w:lsdException w:name="toc 4" w:uiPriority="39" w:semiHidden="1" w:unhideWhenUsed="1"/>
-    <w:lsdException w:name="toc 5" w:uiPriority="39" w:semiHidden="1" w:unhideWhenUsed="1"/>
-    <w:lsdException w:name="toc 6" w:uiPriority="39" w:semiHidden="1" w:unhideWhenUsed="1"/>
-    <w:lsdException w:name="toc 7" w:uiPriority="39" w:semiHidden="1" w:unhideWhenUsed="1"/>
-    <w:lsdException w:name="toc 8" w:uiPriority="39" w:semiHidden="1" w:unhideWhenUsed="1"/>
-    <w:lsdException w:name="toc 9" w:uiPriority="39" w:semiHidden="1" w:unhideWhenUsed="1"/>
+    <w:lsdException w:name="toc 1" w:semiHidden="1" w:uiPriority="39" w:unhideWhenUsed="1"/>
+    <w:lsdException w:name="toc 2" w:semiHidden="1" w:uiPriority="39" w:unhideWhenUsed="1"/>
+    <w:lsdException w:name="toc 3" w:semiHidden="1" w:uiPriority="39" w:unhideWhenUsed="1"/>
+    <w:lsdException w:name="toc 4" w:semiHidden="1" w:uiPriority="39" w:unhideWhenUsed="1"/>
+    <w:lsdException w:name="toc 5" w:semiHidden="1" w:uiPriority="39" w:unhideWhenUsed="1"/>
+    <w:lsdException w:name="toc 6" w:semiHidden="1" w:uiPriority="39" w:unhideWhenUsed="1"/>
+    <w:lsdException w:name="toc 7" w:semiHidden="1" w:uiPriority="39" w:unhideWhenUsed="1"/>
+    <w:lsdException w:name="toc 8" w:semiHidden="1" w:uiPriority="39" w:unhideWhenUsed="1"/>
+    <w:lsdException w:name="toc 9" w:semiHidden="1" w:uiPriority="39" w:unhideWhenUsed="1"/>
     <w:lsdException w:name="Normal Indent" w:semiHidden="1" w:unhideWhenUsed="1"/>
     <w:lsdException w:name="footnote text" w:semiHidden="1" w:unhideWhenUsed="1"/>
     <w:lsdException w:name="annotation text" w:semiHidden="1" w:unhideWhenUsed="1"/>
     <w:lsdException w:name="header" w:semiHidden="1" w:unhideWhenUsed="1"/>
     <w:lsdException w:name="footer" w:semiHidden="1" w:unhideWhenUsed="1"/>
     <w:lsdException w:name="index heading" w:semiHidden="1" w:unhideWhenUsed="1"/>
-    <w:lsdException w:name="caption" w:uiPriority="35" w:semiHidden="1" w:unhideWhenUsed="1" w:qFormat="1"/>
+    <w:lsdException w:name="caption" w:semiHidden="1" w:uiPriority="35" w:unhideWhenUsed="1" w:qFormat="1"/>
     <w:lsdException w:name="table of figures" w:semiHidden="1" w:unhideWhenUsed="1"/>
     <w:lsdException w:name="envelope address" w:semiHidden="1" w:unhideWhenUsed="1"/>
     <w:lsdException w:name="envelope return" w:semiHidden="1" w:unhideWhenUsed="1"/>
@@ -1080,7 +1339,7 @@
     <w:lsdException w:name="Title" w:uiPriority="10" w:qFormat="1"/>
     <w:lsdException w:name="Closing" w:semiHidden="1" w:unhideWhenUsed="1"/>
     <w:lsdException w:name="Signature" w:semiHidden="1" w:unhideWhenUsed="1"/>
-    <w:lsdException w:name="Default Paragraph Font" w:uiPriority="1" w:semiHidden="1" w:unhideWhenUsed="1"/>
+    <w:lsdException w:name="Default Paragraph Font" w:semiHidden="1" w:uiPriority="1" w:unhideWhenUsed="1"/>
     <w:lsdException w:name="Body Text" w:semiHidden="1" w:unhideWhenUsed="1"/>
     <w:lsdException w:name="Body Text Indent" w:semiHidden="1" w:unhideWhenUsed="1"/>
     <w:lsdException w:name="List Continue" w:semiHidden="1" w:unhideWhenUsed="1"/>
@@ -1280,8 +1539,8 @@
     <w:lsdException w:name="Subtle Reference" w:uiPriority="31" w:qFormat="1"/>
     <w:lsdException w:name="Intense Reference" w:uiPriority="32" w:qFormat="1"/>
     <w:lsdException w:name="Book Title" w:uiPriority="33" w:qFormat="1"/>
-    <w:lsdException w:name="Bibliography" w:uiPriority="37" w:semiHidden="1" w:unhideWhenUsed="1"/>
-    <w:lsdException w:name="TOC Heading" w:uiPriority="39" w:semiHidden="1" w:unhideWhenUsed="1" w:qFormat="1"/>
+    <w:lsdException w:name="Bibliography" w:semiHidden="1" w:uiPriority="37" w:unhideWhenUsed="1"/>
+    <w:lsdException w:name="TOC Heading" w:semiHidden="1" w:uiPriority="39" w:unhideWhenUsed="1" w:qFormat="1"/>
     <w:lsdException w:name="Plain Table 1" w:uiPriority="41"/>
     <w:lsdException w:name="Plain Table 2" w:uiPriority="42"/>
     <w:lsdException w:name="Plain Table 3" w:uiPriority="43"/>
@@ -1392,111 +1651,76 @@
     <w:lsdException w:name="Unresolved Mention" w:semiHidden="1" w:unhideWhenUsed="1"/>
     <w:lsdException w:name="Smart Link" w:semiHidden="1" w:unhideWhenUsed="1"/>
   </w:latentStyles>
-  <w:style w:type="paragraph" w:styleId="Normal" w:default="1">
+  <w:style w:type="paragraph" w:default="1" w:styleId="a">
     <w:name w:val="Normal"/>
     <w:qFormat/>
-    <w:rsid w:val="00a03244"/>
+    <w:rsid w:val="00A03244"/>
     <w:pPr>
-      <w:widowControl/>
-      <w:suppressAutoHyphens w:val="true"/>
-      <w:bidi w:val="0"/>
-      <w:spacing w:lineRule="auto" w:line="259" w:before="0" w:after="160"/>
-      <w:jc w:val="left"/>
+      <w:spacing w:after="160" w:line="259" w:lineRule="auto"/>
     </w:pPr>
     <w:rPr>
-      <w:rFonts w:ascii="Calibri" w:hAnsi="Calibri" w:eastAsia="Times New Roman" w:cs="Times New Roman" w:asciiTheme="minorHAnsi" w:hAnsiTheme="minorHAnsi"/>
-      <w:color w:val="auto"/>
-      <w:kern w:val="0"/>
-      <w:sz w:val="22"/>
-      <w:szCs w:val="22"/>
-      <w:lang w:val="ru-RU" w:eastAsia="en-US" w:bidi="ar-SA"/>
+      <w:rFonts w:eastAsia="Times New Roman" w:cs="Times New Roman"/>
     </w:rPr>
   </w:style>
-  <w:style w:type="character" w:styleId="DefaultParagraphFont" w:default="1">
+  <w:style w:type="character" w:default="1" w:styleId="a0">
     <w:name w:val="Default Paragraph Font"/>
     <w:uiPriority w:val="1"/>
     <w:semiHidden/>
     <w:unhideWhenUsed/>
-    <w:qFormat/>
-    <w:rPr/>
   </w:style>
-  <w:style w:type="paragraph" w:styleId="Style14">
-    <w:name w:val="Заголовок"/>
-    <w:basedOn w:val="Normal"/>
-    <w:next w:val="Style15"/>
+  <w:style w:type="table" w:default="1" w:styleId="a1">
+    <w:name w:val="Normal Table"/>
+    <w:uiPriority w:val="99"/>
+    <w:semiHidden/>
+    <w:unhideWhenUsed/>
+    <w:tblPr>
+      <w:tblInd w:w="0" w:type="dxa"/>
+      <w:tblCellMar>
+        <w:top w:w="0" w:type="dxa"/>
+        <w:left w:w="108" w:type="dxa"/>
+        <w:bottom w:w="0" w:type="dxa"/>
+        <w:right w:w="108" w:type="dxa"/>
+      </w:tblCellMar>
+    </w:tblPr>
+  </w:style>
+  <w:style w:type="numbering" w:default="1" w:styleId="a2">
+    <w:name w:val="No List"/>
+    <w:uiPriority w:val="99"/>
+    <w:semiHidden/>
+    <w:unhideWhenUsed/>
+  </w:style>
+  <w:style w:type="paragraph" w:styleId="a3">
+    <w:name w:val="Title"/>
+    <w:basedOn w:val="a"/>
+    <w:next w:val="a4"/>
     <w:qFormat/>
     <w:pPr>
-      <w:keepNext w:val="true"/>
+      <w:keepNext/>
       <w:spacing w:before="240" w:after="120"/>
     </w:pPr>
     <w:rPr>
-      <w:rFonts w:ascii="Liberation Sans" w:hAnsi="Liberation Sans" w:eastAsia="Microsoft YaHei" w:cs="Arial"/>
+      <w:rFonts w:ascii="Liberation Sans" w:eastAsia="Microsoft YaHei" w:hAnsi="Liberation Sans" w:cs="Lucida Sans"/>
       <w:sz w:val="28"/>
       <w:szCs w:val="28"/>
     </w:rPr>
   </w:style>
-  <w:style w:type="paragraph" w:styleId="Style15">
+  <w:style w:type="paragraph" w:styleId="a4">
     <w:name w:val="Body Text"/>
-    <w:basedOn w:val="Normal"/>
+    <w:basedOn w:val="a"/>
     <w:pPr>
-      <w:spacing w:lineRule="auto" w:line="276" w:before="0" w:after="140"/>
+      <w:spacing w:after="140" w:line="276" w:lineRule="auto"/>
     </w:pPr>
-    <w:rPr/>
   </w:style>
-  <w:style w:type="paragraph" w:styleId="Style16">
+  <w:style w:type="paragraph" w:styleId="a5">
     <w:name w:val="List"/>
-    <w:basedOn w:val="Style15"/>
-    <w:pPr/>
+    <w:basedOn w:val="a4"/>
     <w:rPr>
       <w:rFonts w:cs="Lucida Sans"/>
     </w:rPr>
   </w:style>
-  <w:style w:type="paragraph" w:styleId="Style17">
-    <w:name w:val="Caption"/>
-    <w:basedOn w:val="Normal"/>
-    <w:qFormat/>
-    <w:pPr>
-      <w:suppressLineNumbers/>
-      <w:spacing w:before="120" w:after="120"/>
-    </w:pPr>
-    <w:rPr>
-      <w:rFonts w:cs="Arial"/>
-      <w:i/>
-      <w:iCs/>
-      <w:sz w:val="24"/>
-      <w:szCs w:val="24"/>
-    </w:rPr>
-  </w:style>
-  <w:style w:type="paragraph" w:styleId="Style18">
-    <w:name w:val="Указатель"/>
-    <w:basedOn w:val="Normal"/>
-    <w:qFormat/>
-    <w:pPr>
-      <w:suppressLineNumbers/>
-    </w:pPr>
-    <w:rPr>
-      <w:rFonts w:cs="Arial"/>
-      <w:lang w:val="zxx" w:eastAsia="zxx" w:bidi="zxx"/>
-    </w:rPr>
-  </w:style>
-  <w:style w:type="paragraph" w:styleId="Style19">
-    <w:name w:val="Title"/>
-    <w:basedOn w:val="Normal"/>
-    <w:next w:val="Style15"/>
-    <w:qFormat/>
-    <w:pPr>
-      <w:keepNext w:val="true"/>
-      <w:spacing w:before="240" w:after="120"/>
-    </w:pPr>
-    <w:rPr>
-      <w:rFonts w:ascii="Liberation Sans" w:hAnsi="Liberation Sans" w:eastAsia="Microsoft YaHei" w:cs="Lucida Sans"/>
-      <w:sz w:val="28"/>
-      <w:szCs w:val="28"/>
-    </w:rPr>
-  </w:style>
-  <w:style w:type="paragraph" w:styleId="Caption">
+  <w:style w:type="paragraph" w:styleId="a6">
     <w:name w:val="caption"/>
-    <w:basedOn w:val="Normal"/>
+    <w:basedOn w:val="a"/>
     <w:qFormat/>
     <w:pPr>
       <w:suppressLineNumbers/>
@@ -1510,9 +1734,9 @@
       <w:szCs w:val="24"/>
     </w:rPr>
   </w:style>
-  <w:style w:type="paragraph" w:styleId="Indexheading">
+  <w:style w:type="paragraph" w:styleId="a7">
     <w:name w:val="index heading"/>
-    <w:basedOn w:val="Normal"/>
+    <w:basedOn w:val="a"/>
     <w:qFormat/>
     <w:pPr>
       <w:suppressLineNumbers/>
@@ -1520,27 +1744,6 @@
     <w:rPr>
       <w:rFonts w:cs="Lucida Sans"/>
     </w:rPr>
-  </w:style>
-  <w:style w:type="numbering" w:styleId="NoList" w:default="1">
-    <w:name w:val="No List"/>
-    <w:uiPriority w:val="99"/>
-    <w:semiHidden/>
-    <w:unhideWhenUsed/>
-    <w:qFormat/>
-  </w:style>
-  <w:style w:type="table" w:default="1" w:styleId="a1">
-    <w:name w:val="Normal Table"/>
-    <w:uiPriority w:val="99"/>
-    <w:semiHidden/>
-    <w:unhideWhenUsed/>
-    <w:tblPr>
-      <w:tblCellMar>
-        <w:top w:w="0" w:type="dxa"/>
-        <w:left w:w="108" w:type="dxa"/>
-        <w:bottom w:w="0" w:type="dxa"/>
-        <w:right w:w="108" w:type="dxa"/>
-      </w:tblCellMar>
-    </w:tblPr>
   </w:style>
 </w:styles>
 </file>

</xml_diff>